<commit_message>
Dutch series: male protagonist (Niels de Wit)
Co-Authored-By: Claude Opus 5.5 <noreply@anthropic.com>
Claude-Session: https://claude.ai/code/session_014Pwa4fJotSRvNewqVrvk7U
</commit_message>
<xml_diff>
--- a/business_nl/part1/ep01_Vrijmibo.docx
+++ b/business_nl/part1/ep01_Vrijmibo.docx
@@ -180,7 +180,7 @@
                 <w:b w:val="0"/>
                 <w:sz w:val="19"/>
               </w:rPr>
-              <w:t>Noor de Wit (제품 디자이너, 27) · Sem Dijkstra (물류 플래너, 31) · Fleur Mulder (마케터, 33) · Joris Kuipers (복귀한 엔지니어, 39) · Gerrit Postma (조립공·직원평의회 의장, 58) · Marit Hoekstra (대표, 52)</w:t>
+              <w:t>Niels de Wit (제품 디자이너, 27) · Sem Dijkstra (물류 플래너, 31) · Fleur Mulder (마케터, 33) · Joris Kuipers (복귀한 엔지니어, 39) · Gerrit Postma (조립공·직원평의회 의장, 58) · Marit Hoekstra (대표, 52)</w:t>
             </w:r>
           </w:p>
         </w:tc>
@@ -303,7 +303,7 @@
                 <w:b w:val="0"/>
                 <w:sz w:val="19"/>
               </w:rPr>
-              <w:t>대화 120턴 (Sem 27 · Fleur 27 · Noor 25 · Joris 17 · Marit 15 · Gerrit 9) · A2 25% / B1 40% / B2 28% / C1 7% 목표</w:t>
+              <w:t>대화 120턴 (Niels 30 · Sem 26 · Fleur 24 · Joris 17 · Marit 15 · Gerrit 8) · A2 25% / B1 40% / B2 28% / C1 7% 목표</w:t>
             </w:r>
           </w:p>
         </w:tc>
@@ -583,7 +583,7 @@
           <w:color w:val="1F5A8C"/>
           <w:sz w:val="21"/>
         </w:rPr>
-        <w:t>Noor:</w:t>
+        <w:t>Niels:</w:t>
       </w:r>
       <w:r>
         <w:rPr>
@@ -635,7 +635,7 @@
           <w:color w:val="1F5A8C"/>
           <w:sz w:val="21"/>
         </w:rPr>
-        <w:t>Noor:</w:t>
+        <w:t>Niels:</w:t>
       </w:r>
       <w:r>
         <w:rPr>
@@ -687,7 +687,7 @@
           <w:color w:val="1F5A8C"/>
           <w:sz w:val="21"/>
         </w:rPr>
-        <w:t>Noor:</w:t>
+        <w:t>Niels:</w:t>
       </w:r>
       <w:r>
         <w:rPr>
@@ -817,7 +817,7 @@
           <w:color w:val="1F5A8C"/>
           <w:sz w:val="21"/>
         </w:rPr>
-        <w:t>Noor:</w:t>
+        <w:t>Niels:</w:t>
       </w:r>
       <w:r>
         <w:rPr>
@@ -921,7 +921,7 @@
           <w:color w:val="1F5A8C"/>
           <w:sz w:val="21"/>
         </w:rPr>
-        <w:t>Noor:</w:t>
+        <w:t>Niels:</w:t>
       </w:r>
       <w:r>
         <w:rPr>
@@ -1092,7 +1092,7 @@
           <w:color w:val="1F5A8C"/>
           <w:sz w:val="21"/>
         </w:rPr>
-        <w:t>Noor:</w:t>
+        <w:t>Niels:</w:t>
       </w:r>
       <w:r>
         <w:rPr>
@@ -1289,7 +1289,7 @@
           <w:color w:val="1F5A8C"/>
           <w:sz w:val="21"/>
         </w:rPr>
-        <w:t>Noor:</w:t>
+        <w:t>Niels:</w:t>
       </w:r>
       <w:r>
         <w:rPr>
@@ -1419,7 +1419,7 @@
           <w:color w:val="1F5A8C"/>
           <w:sz w:val="21"/>
         </w:rPr>
-        <w:t>Noor:</w:t>
+        <w:t>Niels:</w:t>
       </w:r>
       <w:r>
         <w:rPr>
@@ -1471,7 +1471,7 @@
           <w:color w:val="1F5A8C"/>
           <w:sz w:val="21"/>
         </w:rPr>
-        <w:t>Noor:</w:t>
+        <w:t>Niels:</w:t>
       </w:r>
       <w:r>
         <w:rPr>
@@ -1523,7 +1523,7 @@
           <w:color w:val="1F5A8C"/>
           <w:sz w:val="21"/>
         </w:rPr>
-        <w:t>Noor:</w:t>
+        <w:t>Niels:</w:t>
       </w:r>
       <w:r>
         <w:rPr>
@@ -1557,7 +1557,7 @@
           <w:sz w:val="22"/>
         </w:rPr>
         <w:tab/>
-        <w:t>Zo simpel is het niet, Noor. De lijn is omgebouwd voor de stadsfietsen.</w:t>
+        <w:t>Zo simpel is het niet, Niels. De lijn is omgebouwd voor de stadsfietsen.</w:t>
       </w:r>
     </w:p>
     <w:p>
@@ -1575,7 +1575,7 @@
           <w:color w:val="1F5A8C"/>
           <w:sz w:val="21"/>
         </w:rPr>
-        <w:t>Noor:</w:t>
+        <w:t>Niels:</w:t>
       </w:r>
       <w:r>
         <w:rPr>
@@ -1661,7 +1661,7 @@
           <w:sz w:val="22"/>
         </w:rPr>
         <w:tab/>
-        <w:t>Omdat het meestal zo is. Noor heeft gelijk dat we snel moeten reageren. Zo'n moment duurt een week, misschien twee.</w:t>
+        <w:t>Omdat het meestal zo is. Niels heeft gelijk dat we snel moeten reageren. Zo'n moment duurt een week, misschien twee.</w:t>
       </w:r>
     </w:p>
     <w:p>
@@ -1757,7 +1757,7 @@
           <w:color w:val="1F5A8C"/>
           <w:sz w:val="21"/>
         </w:rPr>
-        <w:t>Noor:</w:t>
+        <w:t>Niels:</w:t>
       </w:r>
       <w:r>
         <w:rPr>
@@ -1861,7 +1861,7 @@
           <w:color w:val="1F5A8C"/>
           <w:sz w:val="21"/>
         </w:rPr>
-        <w:t>Noor:</w:t>
+        <w:t>Niels:</w:t>
       </w:r>
       <w:r>
         <w:rPr>
@@ -1910,10 +1910,10 @@
         <w:rPr>
           <w:rFonts w:ascii="Calibri" w:hAnsi="Calibri" w:eastAsia="Malgun Gothic"/>
           <w:b/>
-          <w:color w:val="2E6B3A"/>
-          <w:sz w:val="21"/>
-        </w:rPr>
-        <w:t>Gerrit:</w:t>
+          <w:color w:val="1F5A8C"/>
+          <w:sz w:val="21"/>
+        </w:rPr>
+        <w:t>Niels:</w:t>
       </w:r>
       <w:r>
         <w:rPr>
@@ -1965,7 +1965,7 @@
           <w:color w:val="1F5A8C"/>
           <w:sz w:val="21"/>
         </w:rPr>
-        <w:t>Noor:</w:t>
+        <w:t>Niels:</w:t>
       </w:r>
       <w:r>
         <w:rPr>
@@ -2069,7 +2069,7 @@
           <w:color w:val="1F5A8C"/>
           <w:sz w:val="21"/>
         </w:rPr>
-        <w:t>Noor:</w:t>
+        <w:t>Niels:</w:t>
       </w:r>
       <w:r>
         <w:rPr>
@@ -2174,10 +2174,10 @@
         <w:rPr>
           <w:rFonts w:ascii="Calibri" w:hAnsi="Calibri" w:eastAsia="Malgun Gothic"/>
           <w:b/>
-          <w:color w:val="0F6E6E"/>
-          <w:sz w:val="21"/>
-        </w:rPr>
-        <w:t>Fleur:</w:t>
+          <w:color w:val="1F5A8C"/>
+          <w:sz w:val="21"/>
+        </w:rPr>
+        <w:t>Niels:</w:t>
       </w:r>
       <w:r>
         <w:rPr>
@@ -2489,7 +2489,7 @@
           <w:color w:val="1F5A8C"/>
           <w:sz w:val="21"/>
         </w:rPr>
-        <w:t>Noor:</w:t>
+        <w:t>Niels:</w:t>
       </w:r>
       <w:r>
         <w:rPr>
@@ -2619,7 +2619,7 @@
           <w:color w:val="1F5A8C"/>
           <w:sz w:val="21"/>
         </w:rPr>
-        <w:t>Noor:</w:t>
+        <w:t>Niels:</w:t>
       </w:r>
       <w:r>
         <w:rPr>
@@ -2653,7 +2653,7 @@
           <w:sz w:val="22"/>
         </w:rPr>
         <w:tab/>
-        <w:t>Laat me even uitpraten, Noor. Ik beslis niet, maar ik wil wel dat jullie vieren dit oppakken. Samen.</w:t>
+        <w:t>Laat me even uitpraten, Niels. Ik beslis niet, maar ik wil wel dat jullie vieren dit oppakken. Samen.</w:t>
       </w:r>
     </w:p>
     <w:p>
@@ -2720,10 +2720,10 @@
         <w:rPr>
           <w:rFonts w:ascii="Calibri" w:hAnsi="Calibri" w:eastAsia="Malgun Gothic"/>
           <w:b/>
-          <w:color w:val="0F6E6E"/>
-          <w:sz w:val="21"/>
-        </w:rPr>
-        <w:t>Fleur:</w:t>
+          <w:color w:val="1F5A8C"/>
+          <w:sz w:val="21"/>
+        </w:rPr>
+        <w:t>Niels:</w:t>
       </w:r>
       <w:r>
         <w:rPr>
@@ -2775,7 +2775,7 @@
           <w:color w:val="1F5A8C"/>
           <w:sz w:val="21"/>
         </w:rPr>
-        <w:t>Noor:</w:t>
+        <w:t>Niels:</w:t>
       </w:r>
       <w:r>
         <w:rPr>
@@ -2824,10 +2824,10 @@
         <w:rPr>
           <w:rFonts w:ascii="Calibri" w:hAnsi="Calibri" w:eastAsia="Malgun Gothic"/>
           <w:b/>
-          <w:color w:val="8A4B0F"/>
-          <w:sz w:val="21"/>
-        </w:rPr>
-        <w:t>Sem:</w:t>
+          <w:color w:val="1F5A8C"/>
+          <w:sz w:val="21"/>
+        </w:rPr>
+        <w:t>Niels:</w:t>
       </w:r>
       <w:r>
         <w:rPr>
@@ -3065,7 +3065,7 @@
           <w:color w:val="1F5A8C"/>
           <w:sz w:val="21"/>
         </w:rPr>
-        <w:t>Noor:</w:t>
+        <w:t>Niels:</w:t>
       </w:r>
       <w:r>
         <w:rPr>
@@ -3247,7 +3247,7 @@
           <w:color w:val="1F5A8C"/>
           <w:sz w:val="21"/>
         </w:rPr>
-        <w:t>Noor:</w:t>
+        <w:t>Niels:</w:t>
       </w:r>
       <w:r>
         <w:rPr>
@@ -3351,7 +3351,7 @@
           <w:color w:val="1F5A8C"/>
           <w:sz w:val="21"/>
         </w:rPr>
-        <w:t>Noor:</w:t>
+        <w:t>Niels:</w:t>
       </w:r>
       <w:r>
         <w:rPr>
@@ -3403,7 +3403,7 @@
           <w:color w:val="1F5A8C"/>
           <w:sz w:val="21"/>
         </w:rPr>
-        <w:t>Noor:</w:t>
+        <w:t>Niels:</w:t>
       </w:r>
       <w:r>
         <w:rPr>
@@ -3452,10 +3452,10 @@
         <w:rPr>
           <w:rFonts w:ascii="Calibri" w:hAnsi="Calibri" w:eastAsia="Malgun Gothic"/>
           <w:b/>
-          <w:color w:val="0F6E6E"/>
-          <w:sz w:val="21"/>
-        </w:rPr>
-        <w:t>Fleur:</w:t>
+          <w:color w:val="1F5A8C"/>
+          <w:sz w:val="21"/>
+        </w:rPr>
+        <w:t>Niels:</w:t>
       </w:r>
       <w:r>
         <w:rPr>
@@ -3463,7 +3463,7 @@
           <w:sz w:val="22"/>
         </w:rPr>
         <w:tab/>
-        <w:t>Hij heeft het niet gezegd, maar hij bedoelt het wel.</w:t>
+        <w:t>Je hebt het niet gezegd, maar je bedoelt het wel.</w:t>
       </w:r>
     </w:p>
     <w:p>
@@ -3533,7 +3533,7 @@
           <w:color w:val="1F5A8C"/>
           <w:sz w:val="21"/>
         </w:rPr>
-        <w:t>Noor:</w:t>
+        <w:t>Niels:</w:t>
       </w:r>
       <w:r>
         <w:rPr>
@@ -3637,7 +3637,7 @@
           <w:color w:val="1F5A8C"/>
           <w:sz w:val="21"/>
         </w:rPr>
-        <w:t>Noor:</w:t>
+        <w:t>Niels:</w:t>
       </w:r>
       <w:r>
         <w:rPr>
@@ -3715,7 +3715,7 @@
           <w:color w:val="1F5A8C"/>
           <w:sz w:val="21"/>
         </w:rPr>
-        <w:t>Noor:</w:t>
+        <w:t>Niels:</w:t>
       </w:r>
       <w:r>
         <w:rPr>
@@ -3764,7 +3764,7 @@
           <w:color w:val="666666"/>
           <w:sz w:val="19"/>
         </w:rPr>
-        <w:t>Ze heffen hun lege glazen. Op dat moment trilt Noors telefoon. Een nieuwe mail in de info-mailbox, in foutloos Nederlands: "Goedemiddag, mijn naam is Kim Seo-yeon. Ik heb in Delft gestudeerd en werk nu voor de gemeente Seoul. Mogen wij u bellen?"</w:t>
+        <w:t>Ze heffen hun lege glazen. Op dat moment trilt Niels' telefoon. Een nieuwe mail in de info-mailbox, in foutloos Nederlands: "Goedemiddag, mijn naam is Kim Seo-yeon. Ik heb in Delft gestudeerd en werk nu voor de gemeente Seoul. Mogen wij u bellen?"</w:t>
       </w:r>
     </w:p>
     <w:p>
@@ -7467,7 +7467,7 @@
           <w:color w:val="1F5A8C"/>
           <w:sz w:val="21"/>
         </w:rPr>
-        <w:t>Noor:</w:t>
+        <w:t>Niels:</w:t>
       </w:r>
       <w:r>
         <w:rPr>
@@ -7519,7 +7519,7 @@
           <w:color w:val="1F5A8C"/>
           <w:sz w:val="21"/>
         </w:rPr>
-        <w:t>Noor:</w:t>
+        <w:t>Niels:</w:t>
       </w:r>
       <w:r>
         <w:rPr>
@@ -7571,7 +7571,7 @@
           <w:color w:val="1F5A8C"/>
           <w:sz w:val="21"/>
         </w:rPr>
-        <w:t>Noor:</w:t>
+        <w:t>Niels:</w:t>
       </w:r>
       <w:r>
         <w:rPr>
@@ -7701,7 +7701,7 @@
           <w:color w:val="1F5A8C"/>
           <w:sz w:val="21"/>
         </w:rPr>
-        <w:t>Noor:</w:t>
+        <w:t>Niels:</w:t>
       </w:r>
       <w:r>
         <w:rPr>
@@ -7805,7 +7805,7 @@
           <w:color w:val="1F5A8C"/>
           <w:sz w:val="21"/>
         </w:rPr>
-        <w:t>Noor:</w:t>
+        <w:t>Niels:</w:t>
       </w:r>
       <w:r>
         <w:rPr>
@@ -7976,7 +7976,7 @@
           <w:color w:val="1F5A8C"/>
           <w:sz w:val="21"/>
         </w:rPr>
-        <w:t>Noor:</w:t>
+        <w:t>Niels:</w:t>
       </w:r>
       <w:r>
         <w:rPr>
@@ -8174,7 +8174,7 @@
           <w:color w:val="1F5A8C"/>
           <w:sz w:val="21"/>
         </w:rPr>
-        <w:t>Noor:</w:t>
+        <w:t>Niels:</w:t>
       </w:r>
       <w:r>
         <w:rPr>
@@ -8304,7 +8304,7 @@
           <w:color w:val="1F5A8C"/>
           <w:sz w:val="21"/>
         </w:rPr>
-        <w:t>Noor:</w:t>
+        <w:t>Niels:</w:t>
       </w:r>
       <w:r>
         <w:rPr>
@@ -8356,7 +8356,7 @@
           <w:color w:val="1F5A8C"/>
           <w:sz w:val="21"/>
         </w:rPr>
-        <w:t>Noor:</w:t>
+        <w:t>Niels:</w:t>
       </w:r>
       <w:r>
         <w:rPr>
@@ -8408,7 +8408,7 @@
           <w:color w:val="1F5A8C"/>
           <w:sz w:val="21"/>
         </w:rPr>
-        <w:t>Noor:</w:t>
+        <w:t>Niels:</w:t>
       </w:r>
       <w:r>
         <w:rPr>
@@ -8442,7 +8442,7 @@
           <w:sz w:val="21"/>
         </w:rPr>
         <w:tab/>
-        <w:t>그렇게 간단하지 않아, 노르. 라인을 시티바이크용으로 바꿔 놨다고.</w:t>
+        <w:t>그렇게 간단하지 않아, 닐스. 라인을 시티바이크용으로 바꿔 놨다고.</w:t>
       </w:r>
     </w:p>
     <w:p>
@@ -8460,7 +8460,7 @@
           <w:color w:val="1F5A8C"/>
           <w:sz w:val="21"/>
         </w:rPr>
-        <w:t>Noor:</w:t>
+        <w:t>Niels:</w:t>
       </w:r>
       <w:r>
         <w:rPr>
@@ -8546,7 +8546,7 @@
           <w:sz w:val="21"/>
         </w:rPr>
         <w:tab/>
-        <w:t>대개 그게 사실이니까. 빨리 반응해야 한다는 건 노르 말이 맞아. 이런 순간은 일주일, 길어야 이 주야.</w:t>
+        <w:t>대개 그게 사실이니까. 빨리 반응해야 한다는 건 닐스 말이 맞아. 이런 순간은 일주일, 길어야 이 주야.</w:t>
       </w:r>
     </w:p>
     <w:p>
@@ -8642,7 +8642,7 @@
           <w:color w:val="1F5A8C"/>
           <w:sz w:val="21"/>
         </w:rPr>
-        <w:t>Noor:</w:t>
+        <w:t>Niels:</w:t>
       </w:r>
       <w:r>
         <w:rPr>
@@ -8746,7 +8746,7 @@
           <w:color w:val="1F5A8C"/>
           <w:sz w:val="21"/>
         </w:rPr>
-        <w:t>Noor:</w:t>
+        <w:t>Niels:</w:t>
       </w:r>
       <w:r>
         <w:rPr>
@@ -8795,10 +8795,10 @@
         <w:rPr>
           <w:rFonts w:ascii="Calibri" w:hAnsi="Calibri" w:eastAsia="Malgun Gothic"/>
           <w:b/>
-          <w:color w:val="2E6B3A"/>
-          <w:sz w:val="21"/>
-        </w:rPr>
-        <w:t>Gerrit:</w:t>
+          <w:color w:val="1F5A8C"/>
+          <w:sz w:val="21"/>
+        </w:rPr>
+        <w:t>Niels:</w:t>
       </w:r>
       <w:r>
         <w:rPr>
@@ -8850,7 +8850,7 @@
           <w:color w:val="1F5A8C"/>
           <w:sz w:val="21"/>
         </w:rPr>
-        <w:t>Noor:</w:t>
+        <w:t>Niels:</w:t>
       </w:r>
       <w:r>
         <w:rPr>
@@ -8954,7 +8954,7 @@
           <w:color w:val="1F5A8C"/>
           <w:sz w:val="21"/>
         </w:rPr>
-        <w:t>Noor:</w:t>
+        <w:t>Niels:</w:t>
       </w:r>
       <w:r>
         <w:rPr>
@@ -9060,10 +9060,10 @@
         <w:rPr>
           <w:rFonts w:ascii="Calibri" w:hAnsi="Calibri" w:eastAsia="Malgun Gothic"/>
           <w:b/>
-          <w:color w:val="0F6E6E"/>
-          <w:sz w:val="21"/>
-        </w:rPr>
-        <w:t>Fleur:</w:t>
+          <w:color w:val="1F5A8C"/>
+          <w:sz w:val="21"/>
+        </w:rPr>
+        <w:t>Niels:</w:t>
       </w:r>
       <w:r>
         <w:rPr>
@@ -9071,7 +9071,7 @@
           <w:sz w:val="21"/>
         </w:rPr>
         <w:tab/>
-        <w:t>당신도 벌써요?</w:t>
+        <w:t>대표님도 벌써요?</w:t>
       </w:r>
     </w:p>
     <w:p>
@@ -9375,7 +9375,7 @@
           <w:color w:val="1F5A8C"/>
           <w:sz w:val="21"/>
         </w:rPr>
-        <w:t>Noor:</w:t>
+        <w:t>Niels:</w:t>
       </w:r>
       <w:r>
         <w:rPr>
@@ -9505,7 +9505,7 @@
           <w:color w:val="1F5A8C"/>
           <w:sz w:val="21"/>
         </w:rPr>
-        <w:t>Noor:</w:t>
+        <w:t>Niels:</w:t>
       </w:r>
       <w:r>
         <w:rPr>
@@ -9539,7 +9539,7 @@
           <w:sz w:val="21"/>
         </w:rPr>
         <w:tab/>
-        <w:t>끝까지 말하게 해 줘, 노르. 결정은 안 하지만 너희 넷이 이 일을 맡았으면 해. 함께.</w:t>
+        <w:t>끝까지 말하게 해 줘, 닐스. 결정은 안 하지만 너희 넷이 이 일을 맡았으면 해. 함께.</w:t>
       </w:r>
     </w:p>
     <w:p>
@@ -9606,10 +9606,10 @@
         <w:rPr>
           <w:rFonts w:ascii="Calibri" w:hAnsi="Calibri" w:eastAsia="Malgun Gothic"/>
           <w:b/>
-          <w:color w:val="0F6E6E"/>
-          <w:sz w:val="21"/>
-        </w:rPr>
-        <w:t>Fleur:</w:t>
+          <w:color w:val="1F5A8C"/>
+          <w:sz w:val="21"/>
+        </w:rPr>
+        <w:t>Niels:</w:t>
       </w:r>
       <w:r>
         <w:rPr>
@@ -9661,7 +9661,7 @@
           <w:color w:val="1F5A8C"/>
           <w:sz w:val="21"/>
         </w:rPr>
-        <w:t>Noor:</w:t>
+        <w:t>Niels:</w:t>
       </w:r>
       <w:r>
         <w:rPr>
@@ -9710,10 +9710,10 @@
         <w:rPr>
           <w:rFonts w:ascii="Calibri" w:hAnsi="Calibri" w:eastAsia="Malgun Gothic"/>
           <w:b/>
-          <w:color w:val="8A4B0F"/>
-          <w:sz w:val="21"/>
-        </w:rPr>
-        <w:t>Sem:</w:t>
+          <w:color w:val="1F5A8C"/>
+          <w:sz w:val="21"/>
+        </w:rPr>
+        <w:t>Niels:</w:t>
       </w:r>
       <w:r>
         <w:rPr>
@@ -9952,7 +9952,7 @@
           <w:color w:val="1F5A8C"/>
           <w:sz w:val="21"/>
         </w:rPr>
-        <w:t>Noor:</w:t>
+        <w:t>Niels:</w:t>
       </w:r>
       <w:r>
         <w:rPr>
@@ -10134,7 +10134,7 @@
           <w:color w:val="1F5A8C"/>
           <w:sz w:val="21"/>
         </w:rPr>
-        <w:t>Noor:</w:t>
+        <w:t>Niels:</w:t>
       </w:r>
       <w:r>
         <w:rPr>
@@ -10238,7 +10238,7 @@
           <w:color w:val="1F5A8C"/>
           <w:sz w:val="21"/>
         </w:rPr>
-        <w:t>Noor:</w:t>
+        <w:t>Niels:</w:t>
       </w:r>
       <w:r>
         <w:rPr>
@@ -10290,7 +10290,7 @@
           <w:color w:val="1F5A8C"/>
           <w:sz w:val="21"/>
         </w:rPr>
-        <w:t>Noor:</w:t>
+        <w:t>Niels:</w:t>
       </w:r>
       <w:r>
         <w:rPr>
@@ -10339,10 +10339,10 @@
         <w:rPr>
           <w:rFonts w:ascii="Calibri" w:hAnsi="Calibri" w:eastAsia="Malgun Gothic"/>
           <w:b/>
-          <w:color w:val="0F6E6E"/>
-          <w:sz w:val="21"/>
-        </w:rPr>
-        <w:t>Fleur:</w:t>
+          <w:color w:val="1F5A8C"/>
+          <w:sz w:val="21"/>
+        </w:rPr>
+        <w:t>Niels:</w:t>
       </w:r>
       <w:r>
         <w:rPr>
@@ -10350,7 +10350,7 @@
           <w:sz w:val="21"/>
         </w:rPr>
         <w:tab/>
-        <w:t>말은 안 했지만 그런 뜻이야.</w:t>
+        <w:t>말은 안 했지만 그런 뜻이잖아.</w:t>
       </w:r>
     </w:p>
     <w:p>
@@ -10420,7 +10420,7 @@
           <w:color w:val="1F5A8C"/>
           <w:sz w:val="21"/>
         </w:rPr>
-        <w:t>Noor:</w:t>
+        <w:t>Niels:</w:t>
       </w:r>
       <w:r>
         <w:rPr>
@@ -10524,7 +10524,7 @@
           <w:color w:val="1F5A8C"/>
           <w:sz w:val="21"/>
         </w:rPr>
-        <w:t>Noor:</w:t>
+        <w:t>Niels:</w:t>
       </w:r>
       <w:r>
         <w:rPr>
@@ -10602,7 +10602,7 @@
           <w:color w:val="1F5A8C"/>
           <w:sz w:val="21"/>
         </w:rPr>
-        <w:t>Noor:</w:t>
+        <w:t>Niels:</w:t>
       </w:r>
       <w:r>
         <w:rPr>
@@ -10651,7 +10651,7 @@
           <w:color w:val="666666"/>
           <w:sz w:val="19"/>
         </w:rPr>
-        <w:t>그들이 빈 잔을 든다. 그 순간 노르의 휴대폰이 진동한다. 안내 메일함에 새 메일이 와 있다. 완벽한 네덜란드어다. "안녕하세요, 저는 김서연입니다. 델프트에서 공부했고 지금은 서울시에서 일하고 있습니다. 전화드려도 될까요?"</w:t>
+        <w:t>그들이 빈 잔을 든다. 그 순간 닐스의 휴대폰이 진동한다. 안내 메일함에 새 메일이 와 있다. 완벽한 네덜란드어다. "안녕하세요, 저는 김서연입니다. 델프트에서 공부했고 지금은 서울시에서 일하고 있습니다. 전화드려도 될까요?"</w:t>
       </w:r>
     </w:p>
     <w:p>

</xml_diff>